<commit_message>
adiciona portal corporativo aos principais projetos
</commit_message>
<xml_diff>
--- a/Murilo Henrique - Curriculo.docx
+++ b/Murilo Henrique - Curriculo.docx
@@ -687,6 +687,50 @@
           <w:rFonts w:ascii="Cambria" w:hAnsi="Cambria" w:cs="Calibri"/>
         </w:rPr>
       </w:pPr>
+    </w:p>
+    <w:p>
+      <w:pPr>
+        <w:rPr>
+          <w:rFonts w:ascii="Cambria" w:hAnsi="Cambria" w:cs="Calibri"/>
+          <w:lang w:val="pt-BR"/>
+        </w:rPr>
+      </w:pPr>
+      <w:r>
+        <w:t>Portal Corporativo de Gestão de Demandas e Soluções Digitais</w:t>
+      </w:r>
+    </w:p>
+    <w:p>
+      <w:pPr>
+        <w:rPr>
+          <w:rFonts w:ascii="Cambria" w:hAnsi="Cambria" w:cs="Calibri"/>
+          <w:lang w:val="pt-BR"/>
+        </w:rPr>
+      </w:pPr>
+      <w:r>
+        <w:t>Desenvolvimento de um portal corporativo inspirado em plataformas de gestão de serviços para centralizar o ciclo completo das demandas, desde a abertura e priorização até o acompanhamento da entrega. A solução organiza responsáveis, anexos, documentação, histórico de decisões e biblioteca de soluções em um único ambiente.</w:t>
+      </w:r>
+    </w:p>
+    <w:p>
+      <w:pPr>
+        <w:rPr>
+          <w:rFonts w:ascii="Cambria" w:hAnsi="Cambria" w:cs="Calibri"/>
+          <w:lang w:val="pt-BR"/>
+        </w:rPr>
+      </w:pPr>
+      <w:r>
+        <w:t>A arquitetura integra Power Apps, SharePoint Lists, Power Automate e Power BI, com componentes personalizados em HTML, CSS e JavaScript. O projeto fortalece a governança documental, reduz controles paralelos e oferece indicadores para monitorar volume, status e tempo de atendimento.</w:t>
+      </w:r>
+    </w:p>
+    <w:p>
+      <w:pPr>
+        <w:rPr>
+          <w:rFonts w:ascii="Cambria" w:hAnsi="Cambria" w:cs="Calibri"/>
+          <w:lang w:val="pt-BR"/>
+        </w:rPr>
+      </w:pPr>
+      <w:r>
+        <w:t>Tecnologias: Power Apps, Power Automate, SharePoint Lists, Power BI, Excel, HTML, CSS e JavaScript.</w:t>
+      </w:r>
     </w:p>
     <w:p>
       <w:pPr>

</xml_diff>

<commit_message>
ajusta destaque do case no currículo
</commit_message>
<xml_diff>
--- a/Murilo Henrique - Curriculo.docx
+++ b/Murilo Henrique - Curriculo.docx
@@ -696,6 +696,9 @@
         </w:rPr>
       </w:pPr>
       <w:r>
+        <w:rPr>
+          <w:b/>
+        </w:rPr>
         <w:t>Portal Corporativo de Gestão de Demandas e Soluções Digitais</w:t>
       </w:r>
     </w:p>
@@ -729,6 +732,9 @@
         </w:rPr>
       </w:pPr>
       <w:r>
+        <w:rPr>
+          <w:i/>
+        </w:rPr>
         <w:t>Tecnologias: Power Apps, Power Automate, SharePoint Lists, Power BI, Excel, HTML, CSS e JavaScript.</w:t>
       </w:r>
     </w:p>

</xml_diff>